<commit_message>
Normalize Last Stand battle language
</commit_message>
<xml_diff>
--- a/releases/v0.6.0/Gauntlet_v0.6.0_Reference_Guide.docx
+++ b/releases/v0.6.0/Gauntlet_v0.6.0_Reference_Guide.docx
@@ -403,7 +403,7 @@
         <w:pStyle w:val="Compact"/>
       </w:pPr>
       <w:r>
-        <w:t xml:space="preserve">Advance beyond it to initiate the opponent’s Last Stand.</w:t>
+        <w:t xml:space="preserve">Advance beyond it; the opponent makes a Last Stand.</w:t>
       </w:r>
     </w:p>
     <w:p>
@@ -415,7 +415,7 @@
         <w:pStyle w:val="Compact"/>
       </w:pPr>
       <w:r>
-        <w:t xml:space="preserve">The defender has Defender’s Advantage and +1.</w:t>
+        <w:t xml:space="preserve">During this battle, the defender has Defender’s Advantage and +1.</w:t>
       </w:r>
     </w:p>
     <w:p>
@@ -427,7 +427,7 @@
         <w:pStyle w:val="Compact"/>
       </w:pPr>
       <w:r>
-        <w:t xml:space="preserve">Win the Last Stand to run the Gauntlet and win.</w:t>
+        <w:t xml:space="preserve">Win the battle to run the Gauntlet and win.</w:t>
       </w:r>
     </w:p>
     <w:bookmarkEnd w:id="23"/>

</xml_diff>